<commit_message>
vault backup: 2026-04-16 14:49:27
</commit_message>
<xml_diff>
--- a/custom-reference.docx
+++ b/custom-reference.docx
@@ -506,7 +506,8 @@
       <w:spacing w:after="120" w:line="360" w:lineRule="auto"/>
     </w:pPr>
     <w:rPr>
-      <w:rFonts w:ascii="Times New Roman" w:hAnsi="Times New Roman" w:eastAsia="宋体"/>
+      <w:rFonts w:ascii="宋体" w:hAnsi="宋体" w:eastAsia="宋体"/>
+      <w:color w:val="000000"/>
       <w:sz w:val="22"/>
     </w:rPr>
   </w:style>
@@ -518,6 +519,10 @@
     <w:pPr>
       <w:spacing w:before="180" w:after="180"/>
     </w:pPr>
+    <w:rPr>
+      <w:rFonts w:ascii="宋体" w:hAnsi="宋体" w:eastAsia="宋体"/>
+      <w:color w:val="000000"/>
+    </w:rPr>
   </w:style>
   <w:style w:type="paragraph" w:customStyle="1" w:styleId="FirstParagraph">
     <w:name w:val="First Paragraph"/>
@@ -528,7 +533,8 @@
       <w:spacing w:after="120" w:line="360" w:lineRule="auto"/>
     </w:pPr>
     <w:rPr>
-      <w:rFonts w:ascii="Times New Roman" w:hAnsi="Times New Roman" w:eastAsia="宋体"/>
+      <w:rFonts w:ascii="宋体" w:hAnsi="宋体" w:eastAsia="宋体"/>
+      <w:color w:val="000000"/>
       <w:sz w:val="22"/>
     </w:rPr>
   </w:style>
@@ -539,6 +545,10 @@
     <w:pPr>
       <w:spacing w:before="36" w:after="36"/>
     </w:pPr>
+    <w:rPr>
+      <w:rFonts w:ascii="宋体" w:hAnsi="宋体" w:eastAsia="宋体"/>
+      <w:color w:val="000000"/>
+    </w:rPr>
   </w:style>
   <w:style w:type="paragraph" w:styleId="Title">
     <w:name w:val="Title"/>
@@ -554,8 +564,9 @@
       <w:jc w:val="center"/>
     </w:pPr>
     <w:rPr>
-      <w:rFonts w:asciiTheme="majorHAnsi" w:eastAsiaTheme="majorEastAsia" w:hAnsiTheme="majorHAnsi" w:cstheme="majorBidi" w:ascii="Times New Roman" w:hAnsi="Times New Roman" w:eastAsia="宋体"/>
+      <w:rFonts w:asciiTheme="majorHAnsi" w:eastAsiaTheme="majorEastAsia" w:hAnsiTheme="majorHAnsi" w:cstheme="majorBidi" w:ascii="宋体" w:hAnsi="宋体" w:eastAsia="宋体"/>
       <w:b/>
+      <w:color w:val="000000"/>
       <w:sz w:val="44"/>
       <w:szCs w:val="56"/>
     </w:rPr>
@@ -567,7 +578,8 @@
     <w:uiPriority w:val="10"/>
     <w:rsid w:val="00A10FD9"/>
     <w:rPr>
-      <w:rFonts w:asciiTheme="majorHAnsi" w:eastAsiaTheme="majorEastAsia" w:hAnsiTheme="majorHAnsi" w:cstheme="majorBidi"/>
+      <w:rFonts w:asciiTheme="majorHAnsi" w:eastAsiaTheme="majorEastAsia" w:hAnsiTheme="majorHAnsi" w:cstheme="majorBidi" w:ascii="宋体" w:hAnsi="宋体" w:eastAsia="宋体"/>
+      <w:color w:val="000000"/>
       <w:sz w:val="56"/>
       <w:szCs w:val="56"/>
     </w:rPr>
@@ -586,7 +598,8 @@
       </w:numPr>
     </w:pPr>
     <w:rPr>
-      <w:rFonts w:eastAsiaTheme="majorEastAsia" w:cstheme="majorBidi"/>
+      <w:rFonts w:eastAsiaTheme="majorEastAsia" w:cstheme="majorBidi" w:ascii="宋体" w:hAnsi="宋体" w:eastAsia="宋体"/>
+      <w:color w:val="000000"/>
       <w:spacing w:val="15"/>
       <w:sz w:val="28"/>
       <w:szCs w:val="28"/>
@@ -599,8 +612,8 @@
     <w:uiPriority w:val="11"/>
     <w:rsid w:val="00A10FD9"/>
     <w:rPr>
-      <w:rFonts w:eastAsiaTheme="majorEastAsia" w:cstheme="majorBidi"/>
-      <w:color w:val="595959" w:themeColor="text1" w:themeTint="A6"/>
+      <w:rFonts w:eastAsiaTheme="majorEastAsia" w:cstheme="majorBidi" w:ascii="宋体" w:hAnsi="宋体" w:eastAsia="宋体"/>
+      <w:color w:val="000000"/>
       <w:spacing w:val="15"/>
       <w:sz w:val="28"/>
       <w:szCs w:val="28"/>
@@ -616,6 +629,8 @@
       <w:keepLines/>
     </w:pPr>
     <w:rPr>
+      <w:rFonts w:ascii="宋体" w:hAnsi="宋体" w:eastAsia="宋体"/>
+      <w:color w:val="000000"/>
       <w:sz w:val="24"/>
       <w:szCs w:val="24"/>
     </w:rPr>
@@ -630,6 +645,8 @@
       <w:keepLines/>
     </w:pPr>
     <w:rPr>
+      <w:rFonts w:ascii="宋体" w:hAnsi="宋体" w:eastAsia="宋体"/>
+      <w:color w:val="000000"/>
       <w:sz w:val="24"/>
       <w:szCs w:val="24"/>
     </w:rPr>
@@ -646,7 +663,9 @@
       <w:jc w:val="center"/>
     </w:pPr>
     <w:rPr>
+      <w:rFonts w:ascii="宋体" w:hAnsi="宋体" w:eastAsia="宋体"/>
       <w:b/>
+      <w:color w:val="000000"/>
       <w:sz w:val="20"/>
       <w:szCs w:val="20"/>
     </w:rPr>
@@ -662,6 +681,8 @@
       <w:spacing w:before="100" w:after="300"/>
     </w:pPr>
     <w:rPr>
+      <w:rFonts w:ascii="宋体" w:hAnsi="宋体" w:eastAsia="宋体"/>
+      <w:color w:val="000000"/>
       <w:sz w:val="20"/>
       <w:szCs w:val="20"/>
     </w:rPr>
@@ -672,7 +693,10 @@
     <w:next w:val="Bibliography"/>
     <w:qFormat/>
     <w:pPr/>
-    <w:rPr/>
+    <w:rPr>
+      <w:rFonts w:ascii="宋体" w:hAnsi="宋体" w:eastAsia="宋体"/>
+      <w:color w:val="000000"/>
+    </w:rPr>
   </w:style>
   <w:style w:type="paragraph" w:styleId="Heading1">
     <w:name w:val="heading 1"/>
@@ -689,9 +713,9 @@
       <w:outlineLvl w:val="0"/>
     </w:pPr>
     <w:rPr>
-      <w:rFonts w:asciiTheme="majorHAnsi" w:eastAsiaTheme="majorEastAsia" w:hAnsiTheme="majorHAnsi" w:cstheme="majorBidi" w:ascii="Times New Roman" w:hAnsi="Times New Roman" w:eastAsia="宋体"/>
+      <w:rFonts w:asciiTheme="majorHAnsi" w:eastAsiaTheme="majorEastAsia" w:hAnsiTheme="majorHAnsi" w:cstheme="majorBidi" w:ascii="宋体" w:hAnsi="宋体" w:eastAsia="宋体"/>
       <w:b/>
-      <w:color w:val="0F4761" w:themeColor="accent1" w:themeShade="BF"/>
+      <w:color w:val="000000"/>
       <w:sz w:val="32"/>
       <w:szCs w:val="40"/>
     </w:rPr>
@@ -713,9 +737,9 @@
       <w:outlineLvl w:val="1"/>
     </w:pPr>
     <w:rPr>
-      <w:rFonts w:asciiTheme="majorHAnsi" w:eastAsiaTheme="majorEastAsia" w:hAnsiTheme="majorHAnsi" w:cstheme="majorBidi" w:ascii="Times New Roman" w:hAnsi="Times New Roman" w:eastAsia="宋体"/>
+      <w:rFonts w:asciiTheme="majorHAnsi" w:eastAsiaTheme="majorEastAsia" w:hAnsiTheme="majorHAnsi" w:cstheme="majorBidi" w:ascii="宋体" w:hAnsi="宋体" w:eastAsia="宋体"/>
       <w:b/>
-      <w:color w:val="0F4761" w:themeColor="accent1" w:themeShade="BF"/>
+      <w:color w:val="000000"/>
       <w:sz w:val="28"/>
       <w:szCs w:val="32"/>
     </w:rPr>
@@ -737,9 +761,9 @@
       <w:outlineLvl w:val="2"/>
     </w:pPr>
     <w:rPr>
-      <w:rFonts w:eastAsiaTheme="majorEastAsia" w:cstheme="majorBidi" w:ascii="Times New Roman" w:hAnsi="Times New Roman" w:eastAsia="宋体"/>
+      <w:rFonts w:eastAsiaTheme="majorEastAsia" w:cstheme="majorBidi" w:ascii="宋体" w:hAnsi="宋体" w:eastAsia="宋体"/>
       <w:b/>
-      <w:color w:val="0F4761" w:themeColor="accent1" w:themeShade="BF"/>
+      <w:color w:val="000000"/>
       <w:sz w:val="24"/>
       <w:szCs w:val="28"/>
     </w:rPr>
@@ -761,10 +785,10 @@
       <w:outlineLvl w:val="3"/>
     </w:pPr>
     <w:rPr>
-      <w:rFonts w:eastAsiaTheme="majorEastAsia" w:cstheme="majorBidi"/>
+      <w:rFonts w:eastAsiaTheme="majorEastAsia" w:cstheme="majorBidi" w:ascii="宋体" w:hAnsi="宋体" w:eastAsia="宋体"/>
       <w:i/>
       <w:iCs/>
-      <w:color w:val="0F4761" w:themeColor="accent1" w:themeShade="BF"/>
+      <w:color w:val="000000"/>
     </w:rPr>
   </w:style>
   <w:style w:type="paragraph" w:styleId="Heading5">
@@ -784,8 +808,8 @@
       <w:outlineLvl w:val="4"/>
     </w:pPr>
     <w:rPr>
-      <w:rFonts w:eastAsiaTheme="majorEastAsia" w:cstheme="majorBidi"/>
-      <w:color w:val="0F4761" w:themeColor="accent1" w:themeShade="BF"/>
+      <w:rFonts w:eastAsiaTheme="majorEastAsia" w:cstheme="majorBidi" w:ascii="宋体" w:hAnsi="宋体" w:eastAsia="宋体"/>
+      <w:color w:val="000000"/>
     </w:rPr>
   </w:style>
   <w:style w:type="paragraph" w:styleId="Heading6">
@@ -805,10 +829,10 @@
       <w:outlineLvl w:val="5"/>
     </w:pPr>
     <w:rPr>
-      <w:rFonts w:eastAsiaTheme="majorEastAsia" w:cstheme="majorBidi"/>
+      <w:rFonts w:eastAsiaTheme="majorEastAsia" w:cstheme="majorBidi" w:ascii="宋体" w:hAnsi="宋体" w:eastAsia="宋体"/>
       <w:i/>
       <w:iCs/>
-      <w:color w:val="595959" w:themeColor="text1" w:themeTint="A6"/>
+      <w:color w:val="000000"/>
     </w:rPr>
   </w:style>
   <w:style w:type="paragraph" w:styleId="Heading7">
@@ -828,8 +852,8 @@
       <w:outlineLvl w:val="6"/>
     </w:pPr>
     <w:rPr>
-      <w:rFonts w:eastAsiaTheme="majorEastAsia" w:cstheme="majorBidi"/>
-      <w:color w:val="595959" w:themeColor="text1" w:themeTint="A6"/>
+      <w:rFonts w:eastAsiaTheme="majorEastAsia" w:cstheme="majorBidi" w:ascii="宋体" w:hAnsi="宋体" w:eastAsia="宋体"/>
+      <w:color w:val="000000"/>
     </w:rPr>
   </w:style>
   <w:style w:type="paragraph" w:styleId="Heading8">
@@ -849,10 +873,10 @@
       <w:outlineLvl w:val="7"/>
     </w:pPr>
     <w:rPr>
-      <w:rFonts w:eastAsiaTheme="majorEastAsia" w:cstheme="majorBidi"/>
+      <w:rFonts w:eastAsiaTheme="majorEastAsia" w:cstheme="majorBidi" w:ascii="宋体" w:hAnsi="宋体" w:eastAsia="宋体"/>
       <w:i/>
       <w:iCs/>
-      <w:color w:val="272727" w:themeColor="text1" w:themeTint="D8"/>
+      <w:color w:val="000000"/>
     </w:rPr>
   </w:style>
   <w:style w:type="paragraph" w:styleId="Heading9">
@@ -872,8 +896,8 @@
       <w:outlineLvl w:val="8"/>
     </w:pPr>
     <w:rPr>
-      <w:rFonts w:eastAsiaTheme="majorEastAsia" w:cstheme="majorBidi"/>
-      <w:color w:val="272727" w:themeColor="text1" w:themeTint="D8"/>
+      <w:rFonts w:eastAsiaTheme="majorEastAsia" w:cstheme="majorBidi" w:ascii="宋体" w:hAnsi="宋体" w:eastAsia="宋体"/>
+      <w:color w:val="000000"/>
     </w:rPr>
   </w:style>
   <w:style w:type="character" w:customStyle="1" w:styleId="Heading1Char">
@@ -883,8 +907,8 @@
     <w:uiPriority w:val="9"/>
     <w:rsid w:val="00A10FD9"/>
     <w:rPr>
-      <w:rFonts w:asciiTheme="majorHAnsi" w:eastAsiaTheme="majorEastAsia" w:hAnsiTheme="majorHAnsi" w:cstheme="majorBidi"/>
-      <w:color w:val="0F4761" w:themeColor="accent1" w:themeShade="BF"/>
+      <w:rFonts w:asciiTheme="majorHAnsi" w:eastAsiaTheme="majorEastAsia" w:hAnsiTheme="majorHAnsi" w:cstheme="majorBidi" w:ascii="宋体" w:hAnsi="宋体" w:eastAsia="宋体"/>
+      <w:color w:val="000000"/>
       <w:sz w:val="40"/>
       <w:szCs w:val="40"/>
     </w:rPr>
@@ -897,8 +921,8 @@
     <w:semiHidden/>
     <w:rsid w:val="00A10FD9"/>
     <w:rPr>
-      <w:rFonts w:asciiTheme="majorHAnsi" w:eastAsiaTheme="majorEastAsia" w:hAnsiTheme="majorHAnsi" w:cstheme="majorBidi"/>
-      <w:color w:val="0F4761" w:themeColor="accent1" w:themeShade="BF"/>
+      <w:rFonts w:asciiTheme="majorHAnsi" w:eastAsiaTheme="majorEastAsia" w:hAnsiTheme="majorHAnsi" w:cstheme="majorBidi" w:ascii="宋体" w:hAnsi="宋体" w:eastAsia="宋体"/>
+      <w:color w:val="000000"/>
       <w:sz w:val="32"/>
       <w:szCs w:val="32"/>
     </w:rPr>
@@ -911,8 +935,8 @@
     <w:semiHidden/>
     <w:rsid w:val="00A10FD9"/>
     <w:rPr>
-      <w:rFonts w:eastAsiaTheme="majorEastAsia" w:cstheme="majorBidi"/>
-      <w:color w:val="0F4761" w:themeColor="accent1" w:themeShade="BF"/>
+      <w:rFonts w:eastAsiaTheme="majorEastAsia" w:cstheme="majorBidi" w:ascii="宋体" w:hAnsi="宋体" w:eastAsia="宋体"/>
+      <w:color w:val="000000"/>
       <w:sz w:val="28"/>
       <w:szCs w:val="28"/>
     </w:rPr>
@@ -925,10 +949,10 @@
     <w:semiHidden/>
     <w:rsid w:val="00A10FD9"/>
     <w:rPr>
-      <w:rFonts w:eastAsiaTheme="majorEastAsia" w:cstheme="majorBidi"/>
+      <w:rFonts w:eastAsiaTheme="majorEastAsia" w:cstheme="majorBidi" w:ascii="宋体" w:hAnsi="宋体" w:eastAsia="宋体"/>
       <w:i/>
       <w:iCs/>
-      <w:color w:val="0F4761" w:themeColor="accent1" w:themeShade="BF"/>
+      <w:color w:val="000000"/>
     </w:rPr>
   </w:style>
   <w:style w:type="character" w:customStyle="1" w:styleId="Heading5Char">
@@ -939,8 +963,8 @@
     <w:semiHidden/>
     <w:rsid w:val="00A10FD9"/>
     <w:rPr>
-      <w:rFonts w:eastAsiaTheme="majorEastAsia" w:cstheme="majorBidi"/>
-      <w:color w:val="0F4761" w:themeColor="accent1" w:themeShade="BF"/>
+      <w:rFonts w:eastAsiaTheme="majorEastAsia" w:cstheme="majorBidi" w:ascii="宋体" w:hAnsi="宋体" w:eastAsia="宋体"/>
+      <w:color w:val="000000"/>
     </w:rPr>
   </w:style>
   <w:style w:type="character" w:customStyle="1" w:styleId="Heading6Char">
@@ -951,10 +975,10 @@
     <w:semiHidden/>
     <w:rsid w:val="00A10FD9"/>
     <w:rPr>
-      <w:rFonts w:eastAsiaTheme="majorEastAsia" w:cstheme="majorBidi"/>
+      <w:rFonts w:eastAsiaTheme="majorEastAsia" w:cstheme="majorBidi" w:ascii="宋体" w:hAnsi="宋体" w:eastAsia="宋体"/>
       <w:i/>
       <w:iCs/>
-      <w:color w:val="595959" w:themeColor="text1" w:themeTint="A6"/>
+      <w:color w:val="000000"/>
     </w:rPr>
   </w:style>
   <w:style w:type="character" w:customStyle="1" w:styleId="Heading7Char">
@@ -965,8 +989,8 @@
     <w:semiHidden/>
     <w:rsid w:val="00A10FD9"/>
     <w:rPr>
-      <w:rFonts w:eastAsiaTheme="majorEastAsia" w:cstheme="majorBidi"/>
-      <w:color w:val="595959" w:themeColor="text1" w:themeTint="A6"/>
+      <w:rFonts w:eastAsiaTheme="majorEastAsia" w:cstheme="majorBidi" w:ascii="宋体" w:hAnsi="宋体" w:eastAsia="宋体"/>
+      <w:color w:val="000000"/>
     </w:rPr>
   </w:style>
   <w:style w:type="character" w:customStyle="1" w:styleId="Heading8Char">
@@ -977,10 +1001,10 @@
     <w:semiHidden/>
     <w:rsid w:val="00A10FD9"/>
     <w:rPr>
-      <w:rFonts w:eastAsiaTheme="majorEastAsia" w:cstheme="majorBidi"/>
+      <w:rFonts w:eastAsiaTheme="majorEastAsia" w:cstheme="majorBidi" w:ascii="宋体" w:hAnsi="宋体" w:eastAsia="宋体"/>
       <w:i/>
       <w:iCs/>
-      <w:color w:val="272727" w:themeColor="text1" w:themeTint="D8"/>
+      <w:color w:val="000000"/>
     </w:rPr>
   </w:style>
   <w:style w:type="character" w:customStyle="1" w:styleId="Heading9Char">
@@ -991,8 +1015,8 @@
     <w:semiHidden/>
     <w:rsid w:val="00A10FD9"/>
     <w:rPr>
-      <w:rFonts w:eastAsiaTheme="majorEastAsia" w:cstheme="majorBidi"/>
-      <w:color w:val="272727" w:themeColor="text1" w:themeTint="D8"/>
+      <w:rFonts w:eastAsiaTheme="majorEastAsia" w:cstheme="majorBidi" w:ascii="宋体" w:hAnsi="宋体" w:eastAsia="宋体"/>
+      <w:color w:val="000000"/>
     </w:rPr>
   </w:style>
   <w:style w:type="paragraph" w:styleId="BlockText">
@@ -1006,6 +1030,10 @@
       <w:spacing w:before="100" w:after="100"/>
       <w:ind w:firstLine="0" w:left="480" w:right="480"/>
     </w:pPr>
+    <w:rPr>
+      <w:rFonts w:ascii="宋体" w:hAnsi="宋体" w:eastAsia="宋体"/>
+      <w:color w:val="000000"/>
+    </w:rPr>
   </w:style>
   <w:style w:type="paragraph" w:styleId="FootnoteText">
     <w:name w:val="Footnote Text"/>
@@ -1014,6 +1042,10 @@
     <w:uiPriority w:val="9"/>
     <w:unhideWhenUsed/>
     <w:qFormat/>
+    <w:rPr>
+      <w:rFonts w:ascii="宋体" w:hAnsi="宋体" w:eastAsia="宋体"/>
+      <w:color w:val="000000"/>
+    </w:rPr>
   </w:style>
   <w:style w:type="paragraph" w:styleId="FootnoteBlockText">
     <w:name w:val="Footnote Block Text"/>
@@ -1026,11 +1058,19 @@
       <w:spacing w:before="100" w:after="100"/>
       <w:ind w:firstLine="0" w:left="480" w:right="480"/>
     </w:pPr>
+    <w:rPr>
+      <w:rFonts w:ascii="宋体" w:hAnsi="宋体" w:eastAsia="宋体"/>
+      <w:color w:val="000000"/>
+    </w:rPr>
   </w:style>
   <w:style w:type="character" w:default="1" w:styleId="DefaultParagraphFont">
     <w:name w:val="Default Paragraph Font"/>
     <w:semiHidden/>
     <w:unhideWhenUsed/>
+    <w:rPr>
+      <w:rFonts w:ascii="宋体" w:hAnsi="宋体" w:eastAsia="宋体"/>
+      <w:color w:val="000000"/>
+    </w:rPr>
   </w:style>
   <w:style w:type="table" w:default="1" w:styleId="Table">
     <w:name w:val="Table"/>
@@ -1038,6 +1078,10 @@
     <w:semiHidden/>
     <w:unhideWhenUsed/>
     <w:qFormat/>
+    <w:rPr>
+      <w:rFonts w:ascii="宋体" w:hAnsi="宋体" w:eastAsia="宋体"/>
+      <w:color w:val="000000"/>
+    </w:rPr>
     <w:tblPr>
       <w:tblInd w:w="0" w:type="dxa"/>
       <w:tblCellMar>
@@ -1066,12 +1110,18 @@
       <w:spacing w:after="0"/>
     </w:pPr>
     <w:rPr>
+      <w:rFonts w:ascii="宋体" w:hAnsi="宋体" w:eastAsia="宋体"/>
       <w:b/>
+      <w:color w:val="000000"/>
     </w:rPr>
   </w:style>
   <w:style w:type="paragraph" w:customStyle="1" w:styleId="Definition">
     <w:name w:val="Definition"/>
     <w:basedOn w:val="Normal"/>
+    <w:rPr>
+      <w:rFonts w:ascii="宋体" w:hAnsi="宋体" w:eastAsia="宋体"/>
+      <w:color w:val="000000"/>
+    </w:rPr>
   </w:style>
   <w:style w:type="paragraph" w:styleId="Caption">
     <w:name w:val="Caption"/>
@@ -1081,7 +1131,9 @@
       <w:spacing w:before="0" w:after="120"/>
     </w:pPr>
     <w:rPr>
+      <w:rFonts w:ascii="宋体" w:hAnsi="宋体" w:eastAsia="宋体"/>
       <w:i/>
+      <w:color w:val="000000"/>
     </w:rPr>
   </w:style>
   <w:style w:type="paragraph" w:customStyle="1" w:styleId="TableCaption">
@@ -1090,14 +1142,26 @@
     <w:pPr>
       <w:keepNext/>
     </w:pPr>
+    <w:rPr>
+      <w:rFonts w:ascii="宋体" w:hAnsi="宋体" w:eastAsia="宋体"/>
+      <w:color w:val="000000"/>
+    </w:rPr>
   </w:style>
   <w:style w:type="paragraph" w:customStyle="1" w:styleId="ImageCaption">
     <w:name w:val="Image Caption"/>
     <w:basedOn w:val="Caption"/>
+    <w:rPr>
+      <w:rFonts w:ascii="宋体" w:hAnsi="宋体" w:eastAsia="宋体"/>
+      <w:color w:val="000000"/>
+    </w:rPr>
   </w:style>
   <w:style w:type="paragraph" w:customStyle="1" w:styleId="Figure">
     <w:name w:val="Figure"/>
     <w:basedOn w:val="Normal"/>
+    <w:rPr>
+      <w:rFonts w:ascii="宋体" w:hAnsi="宋体" w:eastAsia="宋体"/>
+      <w:color w:val="000000"/>
+    </w:rPr>
   </w:style>
   <w:style w:type="paragraph" w:customStyle="1" w:styleId="CaptionedFigure">
     <w:name w:val="Captioned Figure"/>
@@ -1105,28 +1169,43 @@
     <w:pPr>
       <w:keepNext/>
     </w:pPr>
+    <w:rPr>
+      <w:rFonts w:ascii="宋体" w:hAnsi="宋体" w:eastAsia="宋体"/>
+      <w:color w:val="000000"/>
+    </w:rPr>
   </w:style>
   <w:style w:type="character" w:customStyle="1" w:styleId="BodyTextChar">
     <w:name w:val="Body Text Char"/>
     <w:basedOn w:val="DefaultParagraphFont"/>
     <w:link w:val="BodyText"/>
+    <w:rPr>
+      <w:rFonts w:ascii="宋体" w:hAnsi="宋体" w:eastAsia="宋体"/>
+      <w:color w:val="000000"/>
+    </w:rPr>
   </w:style>
   <w:style w:type="character" w:customStyle="1" w:styleId="VerbatimChar">
     <w:name w:val="Verbatim Char"/>
     <w:basedOn w:val="BodyTextChar"/>
     <w:rPr>
-      <w:rFonts w:ascii="Consolas" w:hAnsi="Consolas"/>
+      <w:rFonts w:ascii="宋体" w:hAnsi="宋体" w:eastAsia="宋体"/>
+      <w:color w:val="000000"/>
       <w:sz w:val="22"/>
     </w:rPr>
   </w:style>
   <w:style w:type="character" w:customStyle="1" w:styleId="SectionNumber">
     <w:name w:val="Section Number"/>
     <w:basedOn w:val="BodyTextChar"/>
+    <w:rPr>
+      <w:rFonts w:ascii="宋体" w:hAnsi="宋体" w:eastAsia="宋体"/>
+      <w:color w:val="000000"/>
+    </w:rPr>
   </w:style>
   <w:style w:type="character" w:styleId="FootnoteReference">
     <w:name w:val="Footnote Reference"/>
     <w:basedOn w:val="BodyTextChar"/>
     <w:rPr>
+      <w:rFonts w:ascii="宋体" w:hAnsi="宋体" w:eastAsia="宋体"/>
+      <w:color w:val="000000"/>
       <w:vertAlign w:val="superscript"/>
     </w:rPr>
   </w:style>
@@ -1134,7 +1213,8 @@
     <w:name w:val="Hyperlink"/>
     <w:basedOn w:val="BodyTextChar"/>
     <w:rPr>
-      <w:color w:val="4F81BD" w:themeColor="accent1"/>
+      <w:rFonts w:ascii="宋体" w:hAnsi="宋体" w:eastAsia="宋体"/>
+      <w:color w:val="000000"/>
     </w:rPr>
   </w:style>
   <w:style w:type="paragraph" w:styleId="TOCHeading">
@@ -1149,10 +1229,10 @@
       <w:outlineLvl w:val="9"/>
     </w:pPr>
     <w:rPr>
-      <w:rFonts w:asciiTheme="majorHAnsi" w:eastAsiaTheme="majorEastAsia" w:hAnsiTheme="majorHAnsi" w:cstheme="majorBidi"/>
+      <w:rFonts w:asciiTheme="majorHAnsi" w:eastAsiaTheme="majorEastAsia" w:hAnsiTheme="majorHAnsi" w:cstheme="majorBidi" w:ascii="宋体" w:hAnsi="宋体" w:eastAsia="宋体"/>
       <w:b w:val="0"/>
       <w:bCs w:val="0"/>
-      <w:color w:val="365F91" w:themeColor="accent1" w:themeShade="BF"/>
+      <w:color w:val="000000"/>
     </w:rPr>
   </w:style>
 </w:styles>

</xml_diff>